<commit_message>
PULSE_M1: tördelési javítások (fejezetek új oldalon, ábra és képaláírás együtt)
</commit_message>
<xml_diff>
--- a/docs/M1/PULSE_M1.docx
+++ b/docs/M1/PULSE_M1.docx
@@ -1426,7 +1426,312 @@
     </w:p>
     <w:p>
       <w:pPr>
+        <w:pStyle w:val="Cmsor3"/>
+        <w:rPr>
+          <w:rFonts w:ascii="Calibri" w:eastAsia="Times New Roman" w:hAnsi="Calibri" w:cs="Calibri"/>
+        </w:rPr>
+      </w:pPr>
+      <w:r>
+        <w:rPr>
+          <w:rFonts w:ascii="Calibri" w:eastAsia="Times New Roman" w:hAnsi="Calibri" w:cs="Calibri"/>
+        </w:rPr>
+        <w:t>3.1 Tervezési indoklás</w:t>
+      </w:r>
+    </w:p>
+    <w:p>
+      <w:pPr>
         <w:pStyle w:val="NormlWeb"/>
+        <w:rPr>
+          <w:rFonts w:ascii="Calibri" w:hAnsi="Calibri" w:cs="Calibri"/>
+          <w:color w:val="222222"/>
+          <w:sz w:val="22"/>
+          <w:szCs w:val="22"/>
+        </w:rPr>
+      </w:pPr>
+      <w:r>
+        <w:rPr>
+          <w:rFonts w:ascii="Calibri" w:hAnsi="Calibri" w:cs="Calibri"/>
+          <w:b/>
+          <w:bCs/>
+          <w:color w:val="222222"/>
+          <w:sz w:val="22"/>
+          <w:szCs w:val="22"/>
+        </w:rPr>
+        <w:t>Immutabilis verziók.</w:t>
+      </w:r>
+      <w:r>
+        <w:rPr>
+          <w:rFonts w:ascii="Calibri" w:hAnsi="Calibri" w:cs="Calibri"/>
+          <w:color w:val="222222"/>
+          <w:sz w:val="22"/>
+          <w:szCs w:val="22"/>
+        </w:rPr>
+        <w:t xml:space="preserve"> A Rule és a QuestionnaireTemplate csak identitást hordoz; a tényleges paraméterek a RuleVersion, illetve a QuestionnaireVersion + Question rekordokban élnek, amelyek létrejöttük után nem módosulnak — minden változtatás új verziósort szúr be. Az Alert a kiváltó szabályverzióra, a Submission a kitöltéskori kérdőívverzióra hivatkozik, így a régi riasztások és kitöltések jelentése és pontszáma utólag nem változhat.</w:t>
+      </w:r>
+    </w:p>
+    <w:p>
+      <w:pPr>
+        <w:pStyle w:val="NormlWeb"/>
+        <w:rPr>
+          <w:rFonts w:ascii="Calibri" w:hAnsi="Calibri" w:cs="Calibri"/>
+          <w:color w:val="222222"/>
+          <w:sz w:val="22"/>
+          <w:szCs w:val="22"/>
+        </w:rPr>
+      </w:pPr>
+      <w:r>
+        <w:rPr>
+          <w:rFonts w:ascii="Calibri" w:hAnsi="Calibri" w:cs="Calibri"/>
+          <w:b/>
+          <w:bCs/>
+          <w:color w:val="222222"/>
+          <w:sz w:val="22"/>
+          <w:szCs w:val="22"/>
+        </w:rPr>
+        <w:t>Többértékű mérés.</w:t>
+      </w:r>
+      <w:r>
+        <w:rPr>
+          <w:rFonts w:ascii="Calibri" w:hAnsi="Calibri" w:cs="Calibri"/>
+          <w:color w:val="222222"/>
+          <w:sz w:val="22"/>
+          <w:szCs w:val="22"/>
+        </w:rPr>
+        <w:t xml:space="preserve"> A vérnyomás két értékből áll (szisztolés/diasztolés), ezért a méréstípus komponensekre bomlik (MeasurementComponent), és egy mérés komponensenként egy-egy MeasurementValue sort kap. Ez normalizált megoldás: a szabálykiértékelés komponens-szinten tud küszöböt vizsgálni, és új többértékű típus sémamódosítás nélkül vehető fel. Az alternatíva (értékek JSONB-oszlopban) a dolgozat relációs vs. NoSQL alfejezetében kerül összevetésre.</w:t>
+      </w:r>
+    </w:p>
+    <w:p>
+      <w:pPr>
+        <w:pStyle w:val="NormlWeb"/>
+        <w:rPr>
+          <w:rFonts w:ascii="Calibri" w:hAnsi="Calibri" w:cs="Calibri"/>
+          <w:color w:val="222222"/>
+          <w:sz w:val="22"/>
+          <w:szCs w:val="22"/>
+        </w:rPr>
+      </w:pPr>
+      <w:r>
+        <w:rPr>
+          <w:rFonts w:ascii="Calibri" w:hAnsi="Calibri" w:cs="Calibri"/>
+          <w:b/>
+          <w:bCs/>
+          <w:color w:val="222222"/>
+          <w:sz w:val="22"/>
+          <w:szCs w:val="22"/>
+        </w:rPr>
+        <w:t>Javított mérés.</w:t>
+      </w:r>
+      <w:r>
+        <w:rPr>
+          <w:rFonts w:ascii="Calibri" w:hAnsi="Calibri" w:cs="Calibri"/>
+          <w:color w:val="222222"/>
+          <w:sz w:val="22"/>
+          <w:szCs w:val="22"/>
+        </w:rPr>
+        <w:t xml:space="preserve"> A javítás nem írja felül az eredetit: az új Measurement a corrected_from mezővel hivatkozik rá. A javítás újrakiértékelést vált ki, amely eseményként rögzül az érintett riasztás történetében.</w:t>
+      </w:r>
+    </w:p>
+    <w:p>
+      <w:pPr>
+        <w:pStyle w:val="NormlWeb"/>
+        <w:rPr>
+          <w:rFonts w:ascii="Calibri" w:hAnsi="Calibri" w:cs="Calibri"/>
+          <w:color w:val="222222"/>
+          <w:sz w:val="22"/>
+          <w:szCs w:val="22"/>
+        </w:rPr>
+      </w:pPr>
+      <w:r>
+        <w:rPr>
+          <w:rFonts w:ascii="Calibri" w:hAnsi="Calibri" w:cs="Calibri"/>
+          <w:b/>
+          <w:bCs/>
+          <w:color w:val="222222"/>
+          <w:sz w:val="22"/>
+          <w:szCs w:val="22"/>
+        </w:rPr>
+        <w:t>Riasztás-életút és kézbesítés.</w:t>
+      </w:r>
+      <w:r>
+        <w:rPr>
+          <w:rFonts w:ascii="Calibri" w:hAnsi="Calibri" w:cs="Calibri"/>
+          <w:color w:val="222222"/>
+          <w:sz w:val="22"/>
+          <w:szCs w:val="22"/>
+        </w:rPr>
+        <w:t xml:space="preserve"> Az Alert státuszváltásai kizárólag AlertEvent rögzítésével történnek (ki, mikor, mit, lezárásnál indoklás). Az e-mail-kézbesítést a NotificationDelivery külön követi újrapróbálkozási számlálóval — a riasztás létrejötte tranzakcionális, a küldés ettől független.</w:t>
+      </w:r>
+    </w:p>
+    <w:p>
+      <w:pPr>
+        <w:pStyle w:val="NormlWeb"/>
+        <w:rPr>
+          <w:rFonts w:ascii="Calibri" w:hAnsi="Calibri" w:cs="Calibri"/>
+          <w:color w:val="222222"/>
+          <w:sz w:val="22"/>
+          <w:szCs w:val="22"/>
+        </w:rPr>
+      </w:pPr>
+      <w:r>
+        <w:rPr>
+          <w:rFonts w:ascii="Calibri" w:hAnsi="Calibri" w:cs="Calibri"/>
+          <w:b/>
+          <w:bCs/>
+          <w:color w:val="222222"/>
+          <w:sz w:val="22"/>
+          <w:szCs w:val="22"/>
+        </w:rPr>
+        <w:t>Összerendelés időbeli érvényességgel.</w:t>
+      </w:r>
+      <w:r>
+        <w:rPr>
+          <w:rFonts w:ascii="Calibri" w:hAnsi="Calibri" w:cs="Calibri"/>
+          <w:color w:val="222222"/>
+          <w:sz w:val="22"/>
+          <w:szCs w:val="22"/>
+        </w:rPr>
+        <w:t xml:space="preserve"> A DoctorPatient valid_from / valid_to mezőkkel írja le a kapcsolat élettartamát; a jogosultság-szűrés mindig az aktív (le nem zárt) összerendeléseken alapul.</w:t>
+      </w:r>
+    </w:p>
+    <w:p>
+      <w:pPr>
+        <w:pStyle w:val="NormlWeb"/>
+        <w:rPr>
+          <w:rFonts w:ascii="Calibri" w:hAnsi="Calibri" w:cs="Calibri"/>
+          <w:color w:val="222222"/>
+          <w:sz w:val="22"/>
+          <w:szCs w:val="22"/>
+        </w:rPr>
+      </w:pPr>
+      <w:r>
+        <w:rPr>
+          <w:rFonts w:ascii="Calibri" w:hAnsi="Calibri" w:cs="Calibri"/>
+          <w:b/>
+          <w:bCs/>
+          <w:color w:val="222222"/>
+          <w:sz w:val="22"/>
+          <w:szCs w:val="22"/>
+        </w:rPr>
+        <w:t>UUID elsődleges kulcsok.</w:t>
+      </w:r>
+      <w:r>
+        <w:rPr>
+          <w:rFonts w:ascii="Calibri" w:hAnsi="Calibri" w:cs="Calibri"/>
+          <w:color w:val="222222"/>
+          <w:sz w:val="22"/>
+          <w:szCs w:val="22"/>
+        </w:rPr>
+        <w:t xml:space="preserve"> Minden tábla azonosítója UUID, nem sorszámozott egész. Az elsődleges védelem a szerveroldali jogosultság-szűrés; az UUID pluszréteg (defense in depth): a nagy véletlen tér miatt idegen rekordok azonosítói végigpróbálgatással (enumerációval) nem találhatók el, és az azonosító nem szivárogtat mennyiségi információt. Ára a nagyobb tárigény és a szórtabb index — a vállalt adatmennyiségnél ez nem érdemi hátrány.</w:t>
+      </w:r>
+    </w:p>
+    <w:p>
+      <w:pPr>
+        <w:pStyle w:val="NormlWeb"/>
+        <w:rPr>
+          <w:rFonts w:ascii="Calibri" w:hAnsi="Calibri" w:cs="Calibri"/>
+          <w:color w:val="222222"/>
+          <w:sz w:val="22"/>
+          <w:szCs w:val="22"/>
+        </w:rPr>
+      </w:pPr>
+      <w:r>
+        <w:rPr>
+          <w:rFonts w:ascii="Calibri" w:hAnsi="Calibri" w:cs="Calibri"/>
+          <w:b/>
+          <w:bCs/>
+          <w:color w:val="222222"/>
+          <w:sz w:val="22"/>
+          <w:szCs w:val="22"/>
+        </w:rPr>
+        <w:t>Egész pontszámok.</w:t>
+      </w:r>
+      <w:r>
+        <w:rPr>
+          <w:rFonts w:ascii="Calibri" w:hAnsi="Calibri" w:cs="Calibri"/>
+          <w:color w:val="222222"/>
+          <w:sz w:val="22"/>
+          <w:szCs w:val="22"/>
+        </w:rPr>
+        <w:t xml:space="preserve"> A kérdőív-pontszámok szándékosan egészek: ez a klinikai kérdőívek konvenciója, és kizárja a lebegőpontos összehasonlítás hibáit a szabályhatár-vizsgálatoknál. A szerkesztő kérdésenként csak egész pontot enged felvenni, így az összeg sem lehet tört.</w:t>
+      </w:r>
+    </w:p>
+    <w:p>
+      <w:pPr>
+        <w:pStyle w:val="NormlWeb"/>
+        <w:rPr>
+          <w:rFonts w:ascii="Calibri" w:hAnsi="Calibri" w:cs="Calibri"/>
+          <w:color w:val="222222"/>
+          <w:sz w:val="22"/>
+          <w:szCs w:val="22"/>
+        </w:rPr>
+      </w:pPr>
+      <w:r>
+        <w:rPr>
+          <w:rFonts w:ascii="Calibri" w:hAnsi="Calibri" w:cs="Calibri"/>
+          <w:b/>
+          <w:bCs/>
+          <w:color w:val="222222"/>
+          <w:sz w:val="22"/>
+          <w:szCs w:val="22"/>
+        </w:rPr>
+        <w:t>Tudatosan elhagyott mezők.</w:t>
+      </w:r>
+      <w:r>
+        <w:rPr>
+          <w:rFonts w:ascii="Calibri" w:hAnsi="Calibri" w:cs="Calibri"/>
+          <w:color w:val="222222"/>
+          <w:sz w:val="22"/>
+          <w:szCs w:val="22"/>
+        </w:rPr>
+        <w:t xml:space="preserve"> A betegprofilban éles rendszerben elvárt további adatok — nem, TAJ-szám, telefonszám, lakcím — a demonstrációs scope-ból tudatosan kimaradtak, mert a rendszer kizárólag mesterséges adatokkal dolgozik, és minden további mező karbantartó felületet és tesztet is igényelne. Utólagos felvételük egy-egy oszlop hozzáadása (Alembic-migráció), a szerkezetet nem érinti. </w:t>
+      </w:r>
+      <w:r>
+        <w:rPr>
+          <w:rFonts w:ascii="Calibri" w:hAnsi="Calibri" w:cs="Calibri"/>
+          <w:i/>
+          <w:iCs/>
+          <w:color w:val="222222"/>
+          <w:sz w:val="22"/>
+          <w:szCs w:val="22"/>
+        </w:rPr>
+        <w:t>Konzultációs kérdés: elegendő-e így, vagy kerüljön be 1–2 további mező (pl. nem)?</w:t>
+      </w:r>
+    </w:p>
+    <w:p>
+      <w:pPr>
+        <w:pStyle w:val="NormlWeb"/>
+        <w:rPr>
+          <w:rFonts w:ascii="Calibri" w:hAnsi="Calibri" w:cs="Calibri"/>
+          <w:color w:val="222222"/>
+          <w:sz w:val="22"/>
+          <w:szCs w:val="22"/>
+        </w:rPr>
+      </w:pPr>
+      <w:r>
+        <w:rPr>
+          <w:rFonts w:ascii="Calibri" w:hAnsi="Calibri" w:cs="Calibri"/>
+          <w:b/>
+          <w:bCs/>
+          <w:color w:val="222222"/>
+          <w:sz w:val="22"/>
+          <w:szCs w:val="22"/>
+        </w:rPr>
+        <w:t>Megfontolás alatt:</w:t>
+      </w:r>
+      <w:r>
+        <w:rPr>
+          <w:rFonts w:ascii="Calibri" w:hAnsi="Calibri" w:cs="Calibri"/>
+          <w:color w:val="222222"/>
+          <w:sz w:val="22"/>
+          <w:szCs w:val="22"/>
+        </w:rPr>
+        <w:t xml:space="preserve"> AuditLog tábla az adminisztratív műveletek naplózására — a 2. mérföldkő tapasztalatai alapján dől el, bekerül-e a scope-ba.</w:t>
+      </w:r>
+    </w:p>
+    <w:p>
+      <w:pPr>
+        <w:pStyle w:val="NormlWeb"/>
+        <w:keepNext/>
         <w:jc w:val="center"/>
         <w:rPr>
           <w:rFonts w:ascii="Calibri" w:hAnsi="Calibri" w:cs="Calibri"/>
@@ -1445,6 +1750,7 @@
     <w:p>
       <w:pPr>
         <w:pStyle w:val="NormlWeb"/>
+        <w:keepNext/>
         <w:jc w:val="center"/>
         <w:rPr>
           <w:rFonts w:ascii="Calibri" w:hAnsi="Calibri" w:cs="Calibri"/>
@@ -1462,7 +1768,7 @@
           <w:szCs w:val="22"/>
         </w:rPr>
         <w:drawing>
-          <wp:inline distT="0" distB="0" distL="0" distR="0" wp14:anchorId="31573F25" wp14:editId="0D9420B5">
+          <wp:inline distT="0" distB="0" distL="0" distR="0" wp14:anchorId="5378E0C9" wp14:editId="3361C98C">
             <wp:extent cx="8763000" cy="5179355"/>
             <wp:effectExtent l="0" t="0" r="0" b="2540"/>
             <wp:docPr id="1" name="Kép 1"/>
@@ -1528,7 +1834,7 @@
     </w:p>
     <w:p>
       <w:pPr>
-        <w:pStyle w:val="Cmsor3"/>
+        <w:pStyle w:val="Cmsor2"/>
         <w:rPr>
           <w:rFonts w:ascii="Calibri" w:eastAsia="Times New Roman" w:hAnsi="Calibri" w:cs="Calibri"/>
         </w:rPr>
@@ -1542,6 +1848,20 @@
     </w:p>
     <w:p>
       <w:pPr>
+        <w:pStyle w:val="Cmsor2"/>
+        <w:rPr>
+          <w:rFonts w:ascii="Calibri" w:eastAsia="Times New Roman" w:hAnsi="Calibri" w:cs="Calibri"/>
+        </w:rPr>
+      </w:pPr>
+      <w:r>
+        <w:rPr>
+          <w:rFonts w:ascii="Calibri" w:eastAsia="Times New Roman" w:hAnsi="Calibri" w:cs="Calibri"/>
+        </w:rPr>
+        <w:t>4. Folyamatábrák</w:t>
+      </w:r>
+    </w:p>
+    <w:p>
+      <w:pPr>
         <w:pStyle w:val="Cmsor3"/>
         <w:rPr>
           <w:rFonts w:ascii="Calibri" w:eastAsia="Times New Roman" w:hAnsi="Calibri" w:cs="Calibri"/>
@@ -1551,330 +1871,13 @@
         <w:rPr>
           <w:rFonts w:ascii="Calibri" w:eastAsia="Times New Roman" w:hAnsi="Calibri" w:cs="Calibri"/>
         </w:rPr>
-        <w:t>3.1 Tervezési indoklás</w:t>
+        <w:t>4.1 Riasztás-életút (állapotgép)</w:t>
       </w:r>
     </w:p>
     <w:p>
       <w:pPr>
         <w:pStyle w:val="NormlWeb"/>
-        <w:rPr>
-          <w:rFonts w:ascii="Calibri" w:hAnsi="Calibri" w:cs="Calibri"/>
-          <w:color w:val="222222"/>
-          <w:sz w:val="22"/>
-          <w:szCs w:val="22"/>
-        </w:rPr>
-      </w:pPr>
-      <w:r>
-        <w:rPr>
-          <w:rFonts w:ascii="Calibri" w:hAnsi="Calibri" w:cs="Calibri"/>
-          <w:b/>
-          <w:bCs/>
-          <w:color w:val="222222"/>
-          <w:sz w:val="22"/>
-          <w:szCs w:val="22"/>
-        </w:rPr>
-        <w:t>Immutabilis verziók.</w:t>
-      </w:r>
-      <w:r>
-        <w:rPr>
-          <w:rFonts w:ascii="Calibri" w:hAnsi="Calibri" w:cs="Calibri"/>
-          <w:color w:val="222222"/>
-          <w:sz w:val="22"/>
-          <w:szCs w:val="22"/>
-        </w:rPr>
-        <w:t xml:space="preserve"> A Rule és a QuestionnaireTemplate csak identitást hordoz; a tényleges paraméterek a RuleVersion, illetve a QuestionnaireVersion + Question rekordokban élnek, amelyek létrejöttük után nem módosulnak — minden változtatás új verziósort szúr be. Az Alert a kiváltó szabályverzióra, a Submission a kitöltéskori kérdőívverzióra hivatkozik, így a régi riasztások és kitöltések jelentése és pontszáma utólag nem változhat.</w:t>
-      </w:r>
-    </w:p>
-    <w:p>
-      <w:pPr>
-        <w:pStyle w:val="NormlWeb"/>
-        <w:rPr>
-          <w:rFonts w:ascii="Calibri" w:hAnsi="Calibri" w:cs="Calibri"/>
-          <w:color w:val="222222"/>
-          <w:sz w:val="22"/>
-          <w:szCs w:val="22"/>
-        </w:rPr>
-      </w:pPr>
-      <w:r>
-        <w:rPr>
-          <w:rFonts w:ascii="Calibri" w:hAnsi="Calibri" w:cs="Calibri"/>
-          <w:b/>
-          <w:bCs/>
-          <w:color w:val="222222"/>
-          <w:sz w:val="22"/>
-          <w:szCs w:val="22"/>
-        </w:rPr>
-        <w:t>Többértékű mérés.</w:t>
-      </w:r>
-      <w:r>
-        <w:rPr>
-          <w:rFonts w:ascii="Calibri" w:hAnsi="Calibri" w:cs="Calibri"/>
-          <w:color w:val="222222"/>
-          <w:sz w:val="22"/>
-          <w:szCs w:val="22"/>
-        </w:rPr>
-        <w:t xml:space="preserve"> A vérnyomás két értékből áll (szisztolés/diasztolés), ezért a méréstípus komponensekre bomlik (MeasurementComponent), és egy mérés komponensenként egy-egy MeasurementValue sort kap. Ez normalizált megoldás: a szabálykiértékelés komponens-szinten tud küszöböt vizsgálni, és új többértékű típus sémamódosítás nélkül vehető fel. Az alternatíva (értékek JSONB-oszlopban) a dolgozat relációs vs. NoSQL alfejezetében kerül összevetésre.</w:t>
-      </w:r>
-    </w:p>
-    <w:p>
-      <w:pPr>
-        <w:pStyle w:val="NormlWeb"/>
-        <w:rPr>
-          <w:rFonts w:ascii="Calibri" w:hAnsi="Calibri" w:cs="Calibri"/>
-          <w:color w:val="222222"/>
-          <w:sz w:val="22"/>
-          <w:szCs w:val="22"/>
-        </w:rPr>
-      </w:pPr>
-      <w:r>
-        <w:rPr>
-          <w:rFonts w:ascii="Calibri" w:hAnsi="Calibri" w:cs="Calibri"/>
-          <w:b/>
-          <w:bCs/>
-          <w:color w:val="222222"/>
-          <w:sz w:val="22"/>
-          <w:szCs w:val="22"/>
-        </w:rPr>
-        <w:t>Javított mérés.</w:t>
-      </w:r>
-      <w:r>
-        <w:rPr>
-          <w:rFonts w:ascii="Calibri" w:hAnsi="Calibri" w:cs="Calibri"/>
-          <w:color w:val="222222"/>
-          <w:sz w:val="22"/>
-          <w:szCs w:val="22"/>
-        </w:rPr>
-        <w:t xml:space="preserve"> A javítás nem írja felül az eredetit: az új Measurement a corrected_from mezővel hivatkozik rá. A javítás újrakiértékelést vált ki, amely eseményként rögzül az érintett riasztás történetében.</w:t>
-      </w:r>
-    </w:p>
-    <w:p>
-      <w:pPr>
-        <w:pStyle w:val="NormlWeb"/>
-        <w:rPr>
-          <w:rFonts w:ascii="Calibri" w:hAnsi="Calibri" w:cs="Calibri"/>
-          <w:color w:val="222222"/>
-          <w:sz w:val="22"/>
-          <w:szCs w:val="22"/>
-        </w:rPr>
-      </w:pPr>
-      <w:r>
-        <w:rPr>
-          <w:rFonts w:ascii="Calibri" w:hAnsi="Calibri" w:cs="Calibri"/>
-          <w:b/>
-          <w:bCs/>
-          <w:color w:val="222222"/>
-          <w:sz w:val="22"/>
-          <w:szCs w:val="22"/>
-        </w:rPr>
-        <w:t>Riasztás-életút és kézbesítés.</w:t>
-      </w:r>
-      <w:r>
-        <w:rPr>
-          <w:rFonts w:ascii="Calibri" w:hAnsi="Calibri" w:cs="Calibri"/>
-          <w:color w:val="222222"/>
-          <w:sz w:val="22"/>
-          <w:szCs w:val="22"/>
-        </w:rPr>
-        <w:t xml:space="preserve"> Az Alert státuszváltásai kizárólag AlertEvent rögzítésével történnek (ki, mikor, mit, lezárásnál indoklás). Az e-mail-kézbesítést a NotificationDelivery külön követi újrapróbálkozási számlálóval — a riasztás létrejötte tranzakcionális, a küldés ettől független.</w:t>
-      </w:r>
-    </w:p>
-    <w:p>
-      <w:pPr>
-        <w:pStyle w:val="NormlWeb"/>
-        <w:rPr>
-          <w:rFonts w:ascii="Calibri" w:hAnsi="Calibri" w:cs="Calibri"/>
-          <w:color w:val="222222"/>
-          <w:sz w:val="22"/>
-          <w:szCs w:val="22"/>
-        </w:rPr>
-      </w:pPr>
-      <w:r>
-        <w:rPr>
-          <w:rFonts w:ascii="Calibri" w:hAnsi="Calibri" w:cs="Calibri"/>
-          <w:b/>
-          <w:bCs/>
-          <w:color w:val="222222"/>
-          <w:sz w:val="22"/>
-          <w:szCs w:val="22"/>
-        </w:rPr>
-        <w:t>Összerendelés időbeli érvényességgel.</w:t>
-      </w:r>
-      <w:r>
-        <w:rPr>
-          <w:rFonts w:ascii="Calibri" w:hAnsi="Calibri" w:cs="Calibri"/>
-          <w:color w:val="222222"/>
-          <w:sz w:val="22"/>
-          <w:szCs w:val="22"/>
-        </w:rPr>
-        <w:t xml:space="preserve"> A DoctorPatient valid_from / valid_to mezőkkel írja le a kapcsolat élettartamát; a jogosultság-szűrés mindig az aktív (le nem zárt) összerendeléseken alapul.</w:t>
-      </w:r>
-    </w:p>
-    <w:p>
-      <w:pPr>
-        <w:pStyle w:val="NormlWeb"/>
-        <w:rPr>
-          <w:rFonts w:ascii="Calibri" w:hAnsi="Calibri" w:cs="Calibri"/>
-          <w:color w:val="222222"/>
-          <w:sz w:val="22"/>
-          <w:szCs w:val="22"/>
-        </w:rPr>
-      </w:pPr>
-      <w:r>
-        <w:rPr>
-          <w:rFonts w:ascii="Calibri" w:hAnsi="Calibri" w:cs="Calibri"/>
-          <w:b/>
-          <w:bCs/>
-          <w:color w:val="222222"/>
-          <w:sz w:val="22"/>
-          <w:szCs w:val="22"/>
-        </w:rPr>
-        <w:t>UUID elsődleges kulcsok.</w:t>
-      </w:r>
-      <w:r>
-        <w:rPr>
-          <w:rFonts w:ascii="Calibri" w:hAnsi="Calibri" w:cs="Calibri"/>
-          <w:color w:val="222222"/>
-          <w:sz w:val="22"/>
-          <w:szCs w:val="22"/>
-        </w:rPr>
-        <w:t xml:space="preserve"> Minden tábla azonosítója UUID, nem sorszámozott egész. Az elsődleges védelem a szerveroldali jogosultság-szűrés; az UUID pluszréteg (defense in depth): a nagy véletlen tér miatt idegen rekordok azonosítói végigpróbálgatással (enumerációval) nem találhatók el, és az azonosító nem szivárogtat mennyiségi információt. Ára a nagyobb tárigény és a szórtabb index — a vállalt adatmennyiségnél ez nem érdemi hátrány.</w:t>
-      </w:r>
-    </w:p>
-    <w:p>
-      <w:pPr>
-        <w:pStyle w:val="NormlWeb"/>
-        <w:rPr>
-          <w:rFonts w:ascii="Calibri" w:hAnsi="Calibri" w:cs="Calibri"/>
-          <w:color w:val="222222"/>
-          <w:sz w:val="22"/>
-          <w:szCs w:val="22"/>
-        </w:rPr>
-      </w:pPr>
-      <w:r>
-        <w:rPr>
-          <w:rFonts w:ascii="Calibri" w:hAnsi="Calibri" w:cs="Calibri"/>
-          <w:b/>
-          <w:bCs/>
-          <w:color w:val="222222"/>
-          <w:sz w:val="22"/>
-          <w:szCs w:val="22"/>
-        </w:rPr>
-        <w:t>Egész pontszámok.</w:t>
-      </w:r>
-      <w:r>
-        <w:rPr>
-          <w:rFonts w:ascii="Calibri" w:hAnsi="Calibri" w:cs="Calibri"/>
-          <w:color w:val="222222"/>
-          <w:sz w:val="22"/>
-          <w:szCs w:val="22"/>
-        </w:rPr>
-        <w:t xml:space="preserve"> A kérdőív-pontszámok szándékosan egészek: ez a klinikai kérdőívek konvenciója, és kizárja a lebegőpontos összehasonlítás hibáit a szabályhatár-vizsgálatoknál. A szerkesztő kérdésenként csak egész pontot enged felvenni, így az összeg sem lehet tört.</w:t>
-      </w:r>
-    </w:p>
-    <w:p>
-      <w:pPr>
-        <w:pStyle w:val="NormlWeb"/>
-        <w:rPr>
-          <w:rFonts w:ascii="Calibri" w:hAnsi="Calibri" w:cs="Calibri"/>
-          <w:color w:val="222222"/>
-          <w:sz w:val="22"/>
-          <w:szCs w:val="22"/>
-        </w:rPr>
-      </w:pPr>
-      <w:r>
-        <w:rPr>
-          <w:rFonts w:ascii="Calibri" w:hAnsi="Calibri" w:cs="Calibri"/>
-          <w:b/>
-          <w:bCs/>
-          <w:color w:val="222222"/>
-          <w:sz w:val="22"/>
-          <w:szCs w:val="22"/>
-        </w:rPr>
-        <w:t>Tudatosan elhagyott mezők.</w:t>
-      </w:r>
-      <w:r>
-        <w:rPr>
-          <w:rFonts w:ascii="Calibri" w:hAnsi="Calibri" w:cs="Calibri"/>
-          <w:color w:val="222222"/>
-          <w:sz w:val="22"/>
-          <w:szCs w:val="22"/>
-        </w:rPr>
-        <w:t xml:space="preserve"> A betegprofilban éles rendszerben elvárt további adatok — nem, TAJ-szám, telefonszám, lakcím — a demonstrációs scope-ból tudatosan kimaradtak, mert a rendszer kizárólag mesterséges adatokkal dolgozik, és minden további mező karbantartó felületet és tesztet is igényelne. Utólagos felvételük egy-egy oszlop hozzáadása (Alembic-migráció), a szerkezetet nem érinti. </w:t>
-      </w:r>
-      <w:r>
-        <w:rPr>
-          <w:rFonts w:ascii="Calibri" w:hAnsi="Calibri" w:cs="Calibri"/>
-          <w:i/>
-          <w:iCs/>
-          <w:color w:val="222222"/>
-          <w:sz w:val="22"/>
-          <w:szCs w:val="22"/>
-        </w:rPr>
-        <w:t>Konzultációs kérdés: elegendő-e így, vagy kerüljön be 1–2 további mező (pl. nem)?</w:t>
-      </w:r>
-    </w:p>
-    <w:p>
-      <w:pPr>
-        <w:pStyle w:val="NormlWeb"/>
-        <w:rPr>
-          <w:rFonts w:ascii="Calibri" w:hAnsi="Calibri" w:cs="Calibri"/>
-          <w:color w:val="222222"/>
-          <w:sz w:val="22"/>
-          <w:szCs w:val="22"/>
-        </w:rPr>
-      </w:pPr>
-      <w:r>
-        <w:rPr>
-          <w:rFonts w:ascii="Calibri" w:hAnsi="Calibri" w:cs="Calibri"/>
-          <w:b/>
-          <w:bCs/>
-          <w:color w:val="222222"/>
-          <w:sz w:val="22"/>
-          <w:szCs w:val="22"/>
-        </w:rPr>
-        <w:t>Megfontolás alatt:</w:t>
-      </w:r>
-      <w:r>
-        <w:rPr>
-          <w:rFonts w:ascii="Calibri" w:hAnsi="Calibri" w:cs="Calibri"/>
-          <w:color w:val="222222"/>
-          <w:sz w:val="22"/>
-          <w:szCs w:val="22"/>
-        </w:rPr>
-        <w:t xml:space="preserve"> AuditLog tábla az adminisztratív műveletek naplózására — a 2. mérföldkő tapasztalatai alapján dől el, bekerül-e a scope-ba.</w:t>
-      </w:r>
-    </w:p>
-    <w:p>
-      <w:pPr>
-        <w:pStyle w:val="Cmsor2"/>
-        <w:rPr>
-          <w:rFonts w:ascii="Calibri" w:eastAsia="Times New Roman" w:hAnsi="Calibri" w:cs="Calibri"/>
-        </w:rPr>
-      </w:pPr>
-      <w:r>
-        <w:rPr>
-          <w:rFonts w:ascii="Calibri" w:eastAsia="Times New Roman" w:hAnsi="Calibri" w:cs="Calibri"/>
-        </w:rPr>
-        <w:t>4. Folyamatábrák</w:t>
-      </w:r>
-    </w:p>
-    <w:p>
-      <w:pPr>
-        <w:pStyle w:val="Cmsor3"/>
-        <w:rPr>
-          <w:rFonts w:ascii="Calibri" w:eastAsia="Times New Roman" w:hAnsi="Calibri" w:cs="Calibri"/>
-        </w:rPr>
-      </w:pPr>
-      <w:r>
-        <w:rPr>
-          <w:rFonts w:ascii="Calibri" w:eastAsia="Times New Roman" w:hAnsi="Calibri" w:cs="Calibri"/>
-        </w:rPr>
-        <w:t>4.1 Riasztás-életút (állapotgép)</w:t>
-      </w:r>
-    </w:p>
-    <w:p>
-      <w:pPr>
-        <w:pStyle w:val="NormlWeb"/>
+        <w:keepNext/>
         <w:jc w:val="center"/>
         <w:rPr>
           <w:rFonts w:ascii="Calibri" w:hAnsi="Calibri" w:cs="Calibri"/>
@@ -1892,7 +1895,7 @@
           <w:szCs w:val="22"/>
         </w:rPr>
         <w:drawing>
-          <wp:inline distT="0" distB="0" distL="0" distR="0" wp14:anchorId="5149A08A" wp14:editId="394B01E2">
+          <wp:inline distT="0" distB="0" distL="0" distR="0" wp14:anchorId="4434C6D3" wp14:editId="7D5EA80C">
             <wp:extent cx="5715000" cy="1172990"/>
             <wp:effectExtent l="0" t="0" r="0" b="8255"/>
             <wp:docPr id="2" name="Kép 2"/>
@@ -1993,6 +1996,7 @@
     <w:p>
       <w:pPr>
         <w:pStyle w:val="NormlWeb"/>
+        <w:keepNext/>
         <w:jc w:val="center"/>
         <w:rPr>
           <w:rFonts w:ascii="Calibri" w:hAnsi="Calibri" w:cs="Calibri"/>
@@ -2010,7 +2014,7 @@
           <w:szCs w:val="22"/>
         </w:rPr>
         <w:drawing>
-          <wp:inline distT="0" distB="0" distL="0" distR="0" wp14:anchorId="7D6757FD" wp14:editId="664D29D7">
+          <wp:inline distT="0" distB="0" distL="0" distR="0" wp14:anchorId="5047B1DE" wp14:editId="3E8B3435">
             <wp:extent cx="5715000" cy="1228880"/>
             <wp:effectExtent l="0" t="0" r="0" b="9525"/>
             <wp:docPr id="3" name="Kép 3"/>
@@ -2091,6 +2095,7 @@
     <w:p>
       <w:pPr>
         <w:pStyle w:val="NormlWeb"/>
+        <w:keepNext/>
         <w:jc w:val="center"/>
         <w:rPr>
           <w:rFonts w:ascii="Calibri" w:hAnsi="Calibri" w:cs="Calibri"/>
@@ -2108,7 +2113,7 @@
           <w:szCs w:val="22"/>
         </w:rPr>
         <w:drawing>
-          <wp:inline distT="0" distB="0" distL="0" distR="0" wp14:anchorId="35BBBA82" wp14:editId="60638E0B">
+          <wp:inline distT="0" distB="0" distL="0" distR="0" wp14:anchorId="5BEBE24F" wp14:editId="56B6D160">
             <wp:extent cx="5715000" cy="2940435"/>
             <wp:effectExtent l="0" t="0" r="0" b="0"/>
             <wp:docPr id="4" name="Kép 4"/>
@@ -2229,6 +2234,7 @@
     <w:p>
       <w:pPr>
         <w:pStyle w:val="NormlWeb"/>
+        <w:keepNext/>
         <w:jc w:val="center"/>
         <w:rPr>
           <w:rFonts w:ascii="Calibri" w:hAnsi="Calibri" w:cs="Calibri"/>
@@ -2246,7 +2252,7 @@
           <w:szCs w:val="22"/>
         </w:rPr>
         <w:drawing>
-          <wp:inline distT="0" distB="0" distL="0" distR="0" wp14:anchorId="4E68D3BD" wp14:editId="262994B5">
+          <wp:inline distT="0" distB="0" distL="0" distR="0" wp14:anchorId="0EF42E8A" wp14:editId="4B4656B9">
             <wp:extent cx="5715000" cy="2513588"/>
             <wp:effectExtent l="0" t="0" r="0" b="1270"/>
             <wp:docPr id="5" name="Kép 5"/>
@@ -2313,6 +2319,7 @@
     <w:p>
       <w:pPr>
         <w:pStyle w:val="NormlWeb"/>
+        <w:keepNext/>
         <w:jc w:val="center"/>
         <w:rPr>
           <w:rFonts w:ascii="Calibri" w:hAnsi="Calibri" w:cs="Calibri"/>
@@ -2330,7 +2337,7 @@
           <w:szCs w:val="22"/>
         </w:rPr>
         <w:drawing>
-          <wp:inline distT="0" distB="0" distL="0" distR="0" wp14:anchorId="76052EEE" wp14:editId="170F633C">
+          <wp:inline distT="0" distB="0" distL="0" distR="0" wp14:anchorId="403EAE82" wp14:editId="72D498E5">
             <wp:extent cx="5715000" cy="4250910"/>
             <wp:effectExtent l="0" t="0" r="0" b="0"/>
             <wp:docPr id="6" name="Kép 6"/>
@@ -2397,6 +2404,7 @@
     <w:p>
       <w:pPr>
         <w:pStyle w:val="NormlWeb"/>
+        <w:keepNext/>
         <w:jc w:val="center"/>
         <w:rPr>
           <w:rFonts w:ascii="Calibri" w:hAnsi="Calibri" w:cs="Calibri"/>
@@ -2414,7 +2422,7 @@
           <w:szCs w:val="22"/>
         </w:rPr>
         <w:drawing>
-          <wp:inline distT="0" distB="0" distL="0" distR="0" wp14:anchorId="00D59103" wp14:editId="5894787C">
+          <wp:inline distT="0" distB="0" distL="0" distR="0" wp14:anchorId="4BD6BFD2" wp14:editId="2208DB1C">
             <wp:extent cx="5715000" cy="4202058"/>
             <wp:effectExtent l="0" t="0" r="0" b="8255"/>
             <wp:docPr id="7" name="Kép 7"/>
@@ -2481,6 +2489,7 @@
     <w:p>
       <w:pPr>
         <w:pStyle w:val="NormlWeb"/>
+        <w:keepNext/>
         <w:jc w:val="center"/>
         <w:rPr>
           <w:rFonts w:ascii="Calibri" w:hAnsi="Calibri" w:cs="Calibri"/>
@@ -2498,7 +2507,7 @@
           <w:szCs w:val="22"/>
         </w:rPr>
         <w:drawing>
-          <wp:inline distT="0" distB="0" distL="0" distR="0" wp14:anchorId="67237E02" wp14:editId="2FB3F6BD">
+          <wp:inline distT="0" distB="0" distL="0" distR="0" wp14:anchorId="289A0645" wp14:editId="634F51F5">
             <wp:extent cx="5715000" cy="2698890"/>
             <wp:effectExtent l="0" t="0" r="0" b="6350"/>
             <wp:docPr id="8" name="Kép 8"/>
@@ -2565,6 +2574,7 @@
     <w:p>
       <w:pPr>
         <w:pStyle w:val="NormlWeb"/>
+        <w:keepNext/>
         <w:jc w:val="center"/>
         <w:rPr>
           <w:rFonts w:ascii="Calibri" w:hAnsi="Calibri" w:cs="Calibri"/>
@@ -2582,7 +2592,7 @@
           <w:szCs w:val="22"/>
         </w:rPr>
         <w:drawing>
-          <wp:inline distT="0" distB="0" distL="0" distR="0" wp14:anchorId="16AE9301" wp14:editId="7CE40D1B">
+          <wp:inline distT="0" distB="0" distL="0" distR="0" wp14:anchorId="73A02CE4" wp14:editId="4117AE4F">
             <wp:extent cx="5715000" cy="3246929"/>
             <wp:effectExtent l="0" t="0" r="0" b="0"/>
             <wp:docPr id="9" name="Kép 9"/>
@@ -2649,6 +2659,7 @@
     <w:p>
       <w:pPr>
         <w:pStyle w:val="NormlWeb"/>
+        <w:keepNext/>
         <w:jc w:val="center"/>
         <w:rPr>
           <w:rFonts w:ascii="Calibri" w:hAnsi="Calibri" w:cs="Calibri"/>
@@ -2666,7 +2677,7 @@
           <w:szCs w:val="22"/>
         </w:rPr>
         <w:drawing>
-          <wp:inline distT="0" distB="0" distL="0" distR="0" wp14:anchorId="351C4FFC" wp14:editId="6E3DAE99">
+          <wp:inline distT="0" distB="0" distL="0" distR="0" wp14:anchorId="592A4BB8" wp14:editId="088F79C9">
             <wp:extent cx="5715000" cy="5841214"/>
             <wp:effectExtent l="0" t="0" r="0" b="7620"/>
             <wp:docPr id="10" name="Kép 10"/>
@@ -2733,6 +2744,7 @@
     <w:p>
       <w:pPr>
         <w:pStyle w:val="NormlWeb"/>
+        <w:keepNext/>
         <w:jc w:val="center"/>
         <w:rPr>
           <w:rFonts w:ascii="Calibri" w:hAnsi="Calibri" w:cs="Calibri"/>
@@ -2750,7 +2762,7 @@
           <w:szCs w:val="22"/>
         </w:rPr>
         <w:drawing>
-          <wp:inline distT="0" distB="0" distL="0" distR="0" wp14:anchorId="0B2E6E12" wp14:editId="18E76242">
+          <wp:inline distT="0" distB="0" distL="0" distR="0" wp14:anchorId="2991C8D3" wp14:editId="004B13EF">
             <wp:extent cx="5715000" cy="3427994"/>
             <wp:effectExtent l="0" t="0" r="0" b="1270"/>
             <wp:docPr id="11" name="Kép 11"/>
@@ -2817,6 +2829,7 @@
     <w:p>
       <w:pPr>
         <w:pStyle w:val="NormlWeb"/>
+        <w:keepNext/>
         <w:jc w:val="center"/>
         <w:rPr>
           <w:rFonts w:ascii="Calibri" w:hAnsi="Calibri" w:cs="Calibri"/>
@@ -2834,7 +2847,7 @@
           <w:szCs w:val="22"/>
         </w:rPr>
         <w:drawing>
-          <wp:inline distT="0" distB="0" distL="0" distR="0" wp14:anchorId="59AD548A" wp14:editId="70C78CA4">
+          <wp:inline distT="0" distB="0" distL="0" distR="0" wp14:anchorId="0F18C040" wp14:editId="79153A20">
             <wp:extent cx="5715000" cy="2902937"/>
             <wp:effectExtent l="0" t="0" r="0" b="0"/>
             <wp:docPr id="12" name="Kép 12"/>
@@ -2901,6 +2914,7 @@
     <w:p>
       <w:pPr>
         <w:pStyle w:val="NormlWeb"/>
+        <w:keepNext/>
         <w:jc w:val="center"/>
         <w:rPr>
           <w:rFonts w:ascii="Calibri" w:hAnsi="Calibri" w:cs="Calibri"/>
@@ -2918,7 +2932,7 @@
           <w:szCs w:val="22"/>
         </w:rPr>
         <w:drawing>
-          <wp:inline distT="0" distB="0" distL="0" distR="0" wp14:anchorId="7B996BBB" wp14:editId="39E82DF1">
+          <wp:inline distT="0" distB="0" distL="0" distR="0" wp14:anchorId="250149FD" wp14:editId="72AFAFF9">
             <wp:extent cx="5715000" cy="3466393"/>
             <wp:effectExtent l="0" t="0" r="0" b="1270"/>
             <wp:docPr id="13" name="Kép 13"/>
@@ -2985,6 +2999,7 @@
     <w:p>
       <w:pPr>
         <w:pStyle w:val="NormlWeb"/>
+        <w:keepNext/>
         <w:jc w:val="center"/>
         <w:rPr>
           <w:rFonts w:ascii="Calibri" w:hAnsi="Calibri" w:cs="Calibri"/>
@@ -3002,7 +3017,7 @@
           <w:szCs w:val="22"/>
         </w:rPr>
         <w:drawing>
-          <wp:inline distT="0" distB="0" distL="0" distR="0" wp14:anchorId="33264EEA" wp14:editId="637C9EBF">
+          <wp:inline distT="0" distB="0" distL="0" distR="0" wp14:anchorId="7BD8B1EA" wp14:editId="6B7BD320">
             <wp:extent cx="5715000" cy="6072502"/>
             <wp:effectExtent l="0" t="0" r="0" b="5080"/>
             <wp:docPr id="14" name="Kép 14"/>
@@ -4864,9 +4879,9 @@
 <file path=word/numbering.xml><?xml version="1.0" encoding="utf-8"?>
 <w:numbering xmlns:wpc="http://schemas.microsoft.com/office/word/2010/wordprocessingCanvas" xmlns:cx="http://schemas.microsoft.com/office/drawing/2014/chartex" xmlns:cx1="http://schemas.microsoft.com/office/drawing/2015/9/8/chartex" xmlns:cx2="http://schemas.microsoft.com/office/drawing/2015/10/21/chartex" xmlns:cx3="http://schemas.microsoft.com/office/drawing/2016/5/9/chartex" xmlns:cx4="http://schemas.microsoft.com/office/drawing/2016/5/10/chartex" xmlns:cx5="http://schemas.microsoft.com/office/drawing/2016/5/11/chartex" xmlns:cx6="http://schemas.microsoft.com/office/drawing/2016/5/12/chartex" xmlns:cx7="http://schemas.microsoft.com/office/drawing/2016/5/13/chartex" xmlns:cx8="http://schemas.microsoft.com/office/drawing/2016/5/14/chartex" xmlns:mc="http://schemas.openxmlformats.org/markup-compatibility/2006" xmlns:aink="http://schemas.microsoft.com/office/drawing/2016/ink" xmlns:am3d="http://schemas.microsoft.com/office/drawing/2017/model3d" xmlns:o="urn:schemas-microsoft-com:office:office" xmlns:oel="http://schemas.microsoft.com/office/2019/extlst" xmlns:r="http://schemas.openxmlformats.org/officeDocument/2006/relationships" xmlns:m="http://schemas.openxmlformats.org/officeDocument/2006/math" xmlns:v="urn:schemas-microsoft-com:vml" xmlns:wp14="http://schemas.microsoft.com/office/word/2010/wordprocessingDrawing" xmlns:wp="http://schemas.openxmlformats.org/drawingml/2006/wordprocessingDrawing" xmlns:w10="urn:schemas-microsoft-com:office:word" xmlns:w="http://schemas.openxmlformats.org/wordprocessingml/2006/main" xmlns:w14="http://schemas.microsoft.com/office/word/2010/wordml" xmlns:w15="http://schemas.microsoft.com/office/word/2012/wordml" xmlns:w16cex="http://schemas.microsoft.com/office/word/2018/wordml/cex" xmlns:w16cid="http://schemas.microsoft.com/office/word/2016/wordml/cid" xmlns:w16="http://schemas.microsoft.com/office/word/2018/wordml" xmlns:w16sdtdh="http://schemas.microsoft.com/office/word/2020/wordml/sdtdatahash" xmlns:w16se="http://schemas.microsoft.com/office/word/2015/wordml/symex" xmlns:wpg="http://schemas.microsoft.com/office/word/2010/wordprocessingGroup" xmlns:wpi="http://schemas.microsoft.com/office/word/2010/wordprocessingInk" xmlns:wne="http://schemas.microsoft.com/office/word/2006/wordml" xmlns:wps="http://schemas.microsoft.com/office/word/2010/wordprocessingShape" mc:Ignorable="w14 w15 w16se w16cid w16 w16cex w16sdtdh wp14">
   <w:abstractNum w:abstractNumId="0" w15:restartNumberingAfterBreak="0">
-    <w:nsid w:val="33DA76F8"/>
+    <w:nsid w:val="07767BFB"/>
     <w:multiLevelType w:val="multilevel"/>
-    <w:tmpl w:val="D65AB528"/>
+    <w:tmpl w:val="40AA0A00"/>
     <w:lvl w:ilvl="0">
       <w:start w:val="1"/>
       <w:numFmt w:val="bullet"/>
@@ -5013,9 +5028,9 @@
     </w:lvl>
   </w:abstractNum>
   <w:abstractNum w:abstractNumId="1" w15:restartNumberingAfterBreak="0">
-    <w:nsid w:val="3681253A"/>
+    <w:nsid w:val="2C5C7B1D"/>
     <w:multiLevelType w:val="multilevel"/>
-    <w:tmpl w:val="CD6E94A6"/>
+    <w:tmpl w:val="99CA5728"/>
     <w:lvl w:ilvl="0">
       <w:start w:val="1"/>
       <w:numFmt w:val="bullet"/>
@@ -5162,9 +5177,9 @@
     </w:lvl>
   </w:abstractNum>
   <w:abstractNum w:abstractNumId="2" w15:restartNumberingAfterBreak="0">
-    <w:nsid w:val="46893D07"/>
+    <w:nsid w:val="41C024DF"/>
     <w:multiLevelType w:val="multilevel"/>
-    <w:tmpl w:val="D80E0D5A"/>
+    <w:tmpl w:val="80B2AE56"/>
     <w:lvl w:ilvl="0">
       <w:start w:val="1"/>
       <w:numFmt w:val="bullet"/>
@@ -5311,9 +5326,9 @@
     </w:lvl>
   </w:abstractNum>
   <w:abstractNum w:abstractNumId="3" w15:restartNumberingAfterBreak="0">
-    <w:nsid w:val="4DA861DE"/>
+    <w:nsid w:val="53181309"/>
     <w:multiLevelType w:val="multilevel"/>
-    <w:tmpl w:val="B6C40AAE"/>
+    <w:tmpl w:val="CC380DF8"/>
     <w:lvl w:ilvl="0">
       <w:start w:val="1"/>
       <w:numFmt w:val="bullet"/>
@@ -5460,9 +5475,9 @@
     </w:lvl>
   </w:abstractNum>
   <w:abstractNum w:abstractNumId="4" w15:restartNumberingAfterBreak="0">
-    <w:nsid w:val="59F14616"/>
+    <w:nsid w:val="57A820DF"/>
     <w:multiLevelType w:val="multilevel"/>
-    <w:tmpl w:val="F9BEA4E6"/>
+    <w:tmpl w:val="875EA2E8"/>
     <w:lvl w:ilvl="0">
       <w:start w:val="1"/>
       <w:numFmt w:val="bullet"/>
@@ -5609,9 +5624,9 @@
     </w:lvl>
   </w:abstractNum>
   <w:abstractNum w:abstractNumId="5" w15:restartNumberingAfterBreak="0">
-    <w:nsid w:val="5EA235F3"/>
+    <w:nsid w:val="5E227B2E"/>
     <w:multiLevelType w:val="multilevel"/>
-    <w:tmpl w:val="D01433B6"/>
+    <w:tmpl w:val="EC2601B8"/>
     <w:lvl w:ilvl="0">
       <w:start w:val="1"/>
       <w:numFmt w:val="bullet"/>
@@ -5757,23 +5772,23 @@
       </w:rPr>
     </w:lvl>
   </w:abstractNum>
-  <w:num w:numId="1" w16cid:durableId="1093089681">
+  <w:num w:numId="1" w16cid:durableId="325746158">
+    <w:abstractNumId w:val="0"/>
+  </w:num>
+  <w:num w:numId="2" w16cid:durableId="870151507">
+    <w:abstractNumId w:val="5"/>
+  </w:num>
+  <w:num w:numId="3" w16cid:durableId="417215463">
+    <w:abstractNumId w:val="3"/>
+  </w:num>
+  <w:num w:numId="4" w16cid:durableId="157581231">
     <w:abstractNumId w:val="4"/>
   </w:num>
-  <w:num w:numId="2" w16cid:durableId="546645549">
+  <w:num w:numId="5" w16cid:durableId="169180723">
     <w:abstractNumId w:val="1"/>
   </w:num>
-  <w:num w:numId="3" w16cid:durableId="981077267">
+  <w:num w:numId="6" w16cid:durableId="1667979555">
     <w:abstractNumId w:val="2"/>
-  </w:num>
-  <w:num w:numId="4" w16cid:durableId="377509689">
-    <w:abstractNumId w:val="0"/>
-  </w:num>
-  <w:num w:numId="5" w16cid:durableId="214314402">
-    <w:abstractNumId w:val="5"/>
-  </w:num>
-  <w:num w:numId="6" w16cid:durableId="51974603">
-    <w:abstractNumId w:val="3"/>
   </w:num>
 </w:numbering>
 </file>

</xml_diff>